<commit_message>
update mid-term report meterials
</commit_message>
<xml_diff>
--- a/research_materials/system_design/supplement_design_WANG_HAOXIN.docx
+++ b/research_materials/system_design/supplement_design_WANG_HAOXIN.docx
@@ -15,6 +15,30 @@
           <w:lang w:val="en-US" w:eastAsia="zh-CN"/>
         </w:rPr>
         <w:t>Requirement:</w:t>
+      </w:r>
+    </w:p>
+    <w:p>
+      <w:pPr>
+        <w:rPr>
+          <w:rFonts w:hint="default"/>
+          <w:lang w:val="en-US" w:eastAsia="zh-CN"/>
+        </w:rPr>
+      </w:pPr>
+      <w:r>
+        <w:rPr>
+          <w:rFonts w:hint="eastAsia"/>
+          <w:lang w:val="en-US" w:eastAsia="zh-CN"/>
+        </w:rPr>
+        <w:t>supplement elements -&gt; framework -&gt; code program(Display) -&gt; modeling(Display) -&gt; object</w:t>
+      </w:r>
+      <w:bookmarkStart w:id="0" w:name="_GoBack"/>
+      <w:bookmarkEnd w:id="0"/>
+      <w:r>
+        <w:rPr>
+          <w:rFonts w:hint="eastAsia"/>
+          <w:lang w:val="en-US" w:eastAsia="zh-CN"/>
+        </w:rPr>
+        <w:t xml:space="preserve"> </w:t>
       </w:r>
     </w:p>
     <w:p>
@@ -389,373 +413,6 @@
         </w:rPr>
         <w:t>雪的结构, 雪损识别, 透射衰减与非均匀遮挡, 雪的反射光谱特性, 复杂地表</w:t>
       </w:r>
-    </w:p>
-    <w:p>
-      <w:pPr>
-        <w:rPr>
-          <w:rFonts w:hint="default"/>
-          <w:lang w:val="en-US" w:eastAsia="zh-CN"/>
-        </w:rPr>
-      </w:pPr>
-    </w:p>
-    <w:p>
-      <w:pPr>
-        <w:rPr>
-          <w:rFonts w:hint="default"/>
-          <w:lang w:val="en-US" w:eastAsia="zh-CN"/>
-        </w:rPr>
-      </w:pPr>
-    </w:p>
-    <w:p>
-      <w:pPr>
-        <w:rPr>
-          <w:rFonts w:hint="default"/>
-          <w:lang w:val="en-US" w:eastAsia="zh-CN"/>
-        </w:rPr>
-      </w:pPr>
-    </w:p>
-    <w:p>
-      <w:pPr>
-        <w:rPr>
-          <w:rFonts w:hint="default"/>
-          <w:lang w:val="en-US" w:eastAsia="zh-CN"/>
-        </w:rPr>
-      </w:pPr>
-    </w:p>
-    <w:p>
-      <w:pPr>
-        <w:rPr>
-          <w:rFonts w:hint="default"/>
-          <w:lang w:val="en-US" w:eastAsia="zh-CN"/>
-        </w:rPr>
-      </w:pPr>
-    </w:p>
-    <w:p>
-      <w:pPr>
-        <w:rPr>
-          <w:rFonts w:hint="eastAsia"/>
-          <w:lang w:val="en-US" w:eastAsia="zh-CN"/>
-        </w:rPr>
-      </w:pPr>
-      <w:r>
-        <w:rPr>
-          <w:rFonts w:hint="eastAsia"/>
-          <w:lang w:val="en-US" w:eastAsia="zh-CN"/>
-        </w:rPr>
-        <w:t>spectral effect:</w:t>
-      </w:r>
-    </w:p>
-    <w:p>
-      <w:pPr>
-        <w:rPr>
-          <w:rFonts w:hint="eastAsia"/>
-          <w:lang w:val="en-US" w:eastAsia="zh-CN"/>
-        </w:rPr>
-      </w:pPr>
-      <w:r>
-        <w:rPr>
-          <w:rFonts w:hint="eastAsia"/>
-          <w:lang w:val="en-US" w:eastAsia="zh-CN"/>
-        </w:rPr>
-        <w:t>光伏板的SR(λ)测量    雪地的α(λ)获取</w:t>
-      </w:r>
-    </w:p>
-    <w:p>
-      <w:pPr>
-        <w:rPr>
-          <w:rFonts w:hint="eastAsia"/>
-          <w:lang w:val="en-US" w:eastAsia="zh-CN"/>
-        </w:rPr>
-      </w:pPr>
-      <w:r>
-        <w:rPr>
-          <w:rFonts w:hint="eastAsia"/>
-          <w:lang w:val="en-US" w:eastAsia="zh-CN"/>
-        </w:rPr>
-        <w:t>天空散射, 直射+ SR(λ)影响</w:t>
-      </w:r>
-    </w:p>
-    <w:p>
-      <w:pPr>
-        <w:rPr>
-          <w:rFonts w:hint="eastAsia"/>
-          <w:lang w:val="en-US" w:eastAsia="zh-CN"/>
-        </w:rPr>
-      </w:pPr>
-      <w:r>
-        <w:rPr>
-          <w:rFonts w:hint="eastAsia"/>
-          <w:lang w:val="en-US" w:eastAsia="zh-CN"/>
-        </w:rPr>
-        <w:t>地面散射+ SR(λ)&amp; α(λ)的影响</w:t>
-      </w:r>
-    </w:p>
-    <w:p>
-      <w:pPr>
-        <w:rPr>
-          <w:rFonts w:hint="default"/>
-          <w:lang w:val="en-US" w:eastAsia="zh-CN"/>
-        </w:rPr>
-      </w:pPr>
-      <w:r>
-        <w:rPr>
-          <w:rFonts w:hint="eastAsia"/>
-          <w:lang w:val="en-US" w:eastAsia="zh-CN"/>
-        </w:rPr>
-        <w:t>太阳光谱, 经过云层吸收后的光谱</w:t>
-      </w:r>
-      <w:bookmarkStart w:id="0" w:name="_GoBack"/>
-      <w:bookmarkEnd w:id="0"/>
-    </w:p>
-    <w:p>
-      <w:pPr>
-        <w:rPr>
-          <w:rFonts w:hint="eastAsia"/>
-          <w:lang w:val="en-US" w:eastAsia="zh-CN"/>
-        </w:rPr>
-      </w:pPr>
-    </w:p>
-    <w:p>
-      <w:pPr>
-        <w:rPr>
-          <w:rFonts w:hint="eastAsia"/>
-          <w:lang w:val="en-US" w:eastAsia="zh-CN"/>
-        </w:rPr>
-      </w:pPr>
-      <w:r>
-        <w:rPr>
-          <w:rFonts w:ascii="Google Sans Text" w:hAnsi="Google Sans Text" w:eastAsia="Google Sans Text" w:cs="Google Sans Text"/>
-          <w:i w:val="0"/>
-          <w:iCs w:val="0"/>
-          <w:caps w:val="0"/>
-          <w:color w:val="303030"/>
-          <w:spacing w:val="0"/>
-          <w:sz w:val="16"/>
-          <w:szCs w:val="16"/>
-          <w:shd w:val="clear" w:fill="FFFFFF"/>
-        </w:rPr>
-        <w:t>双面组件由于背面吸收地面反射光产生热量，可能比单面组件</w:t>
-      </w:r>
-      <w:r>
-        <w:rPr>
-          <w:rFonts w:hint="default" w:ascii="Google Sans Text" w:hAnsi="Google Sans Text" w:eastAsia="Google Sans Text" w:cs="Google Sans Text"/>
-          <w:b/>
-          <w:bCs/>
-          <w:i w:val="0"/>
-          <w:iCs w:val="0"/>
-          <w:caps w:val="0"/>
-          <w:color w:val="303030"/>
-          <w:spacing w:val="0"/>
-          <w:sz w:val="16"/>
-          <w:szCs w:val="16"/>
-          <w:shd w:val="clear" w:fill="FFFFFF"/>
-        </w:rPr>
-        <w:t>除雪速度更快</w:t>
-      </w:r>
-    </w:p>
-    <w:p>
-      <w:pPr>
-        <w:rPr>
-          <w:rFonts w:hint="default"/>
-          <w:lang w:val="en-US" w:eastAsia="zh-CN"/>
-        </w:rPr>
-      </w:pPr>
-      <w:r>
-        <w:rPr>
-          <w:rFonts w:hint="default"/>
-          <w:lang w:val="en-US" w:eastAsia="zh-CN"/>
-        </w:rPr>
-        <w:t>无框组件结构更有利于积雪滑动</w:t>
-      </w:r>
-    </w:p>
-    <w:p>
-      <w:pPr>
-        <w:rPr>
-          <w:rFonts w:hint="default"/>
-          <w:lang w:val="en-US" w:eastAsia="zh-CN"/>
-        </w:rPr>
-      </w:pPr>
-    </w:p>
-    <w:p>
-      <w:pPr>
-        <w:rPr>
-          <w:rFonts w:hint="default"/>
-          <w:lang w:val="en-US" w:eastAsia="zh-CN"/>
-        </w:rPr>
-      </w:pPr>
-      <w:r>
-        <w:rPr>
-          <w:rFonts w:hint="eastAsia"/>
-          <w:lang w:val="en-US" w:eastAsia="zh-CN"/>
-        </w:rPr>
-        <w:t xml:space="preserve">SMM: </w:t>
-      </w:r>
-    </w:p>
-    <w:p>
-      <w:pPr>
-        <w:rPr>
-          <w:rFonts w:hint="default"/>
-          <w:lang w:val="en-US" w:eastAsia="zh-CN"/>
-        </w:rPr>
-      </w:pPr>
-      <w:r>
-        <w:rPr>
-          <w:rFonts w:hint="default"/>
-          <w:lang w:val="en-US" w:eastAsia="zh-CN"/>
-        </w:rPr>
-        <w:t xml:space="preserve">SMM = [∫E_ref(λ)·S_ref(λ)dλ × ∫E_meas(λ)·S_DUT(λ)dλ] </w:t>
-      </w:r>
-    </w:p>
-    <w:p>
-      <w:pPr>
-        <w:ind w:left="420" w:leftChars="0" w:firstLine="420" w:firstLineChars="0"/>
-        <w:rPr>
-          <w:rFonts w:hint="default"/>
-          <w:lang w:val="en-US" w:eastAsia="zh-CN"/>
-        </w:rPr>
-      </w:pPr>
-      <w:r>
-        <w:rPr>
-          <w:rFonts w:hint="default"/>
-          <w:lang w:val="en-US" w:eastAsia="zh-CN"/>
-        </w:rPr>
-        <w:t>/</w:t>
-      </w:r>
-      <w:r>
-        <w:rPr>
-          <w:rFonts w:hint="eastAsia"/>
-          <w:lang w:val="en-US" w:eastAsia="zh-CN"/>
-        </w:rPr>
-        <w:t xml:space="preserve"> </w:t>
-      </w:r>
-      <w:r>
-        <w:rPr>
-          <w:rFonts w:hint="default"/>
-          <w:lang w:val="en-US" w:eastAsia="zh-CN"/>
-        </w:rPr>
-        <w:t>[∫E_meas(λ)·S_ref(λ)dλ × ∫E_ref(λ)·S_DUT(λ)dλ]</w:t>
-      </w:r>
-    </w:p>
-    <w:p>
-      <w:pPr>
-        <w:rPr>
-          <w:rFonts w:hint="default"/>
-          <w:lang w:val="en-US" w:eastAsia="zh-CN"/>
-        </w:rPr>
-      </w:pPr>
-      <w:r>
-        <w:rPr>
-          <w:rFonts w:hint="default"/>
-          <w:lang w:val="en-US" w:eastAsia="zh-CN"/>
-        </w:rPr>
-        <w:t>其中：</w:t>
-      </w:r>
-    </w:p>
-    <w:p>
-      <w:pPr>
-        <w:rPr>
-          <w:rFonts w:hint="default"/>
-          <w:lang w:val="en-US" w:eastAsia="zh-CN"/>
-        </w:rPr>
-      </w:pPr>
-      <w:r>
-        <w:rPr>
-          <w:rFonts w:hint="default"/>
-          <w:lang w:val="en-US" w:eastAsia="zh-CN"/>
-        </w:rPr>
-        <w:t>E_ref(λ)：参考光谱（如AM1.5G）</w:t>
-      </w:r>
-    </w:p>
-    <w:p>
-      <w:pPr>
-        <w:rPr>
-          <w:rFonts w:hint="default"/>
-          <w:lang w:val="en-US" w:eastAsia="zh-CN"/>
-        </w:rPr>
-      </w:pPr>
-      <w:r>
-        <w:rPr>
-          <w:rFonts w:hint="default"/>
-          <w:lang w:val="en-US" w:eastAsia="zh-CN"/>
-        </w:rPr>
-        <w:t>E_meas(λ)：实际测试光谱</w:t>
-      </w:r>
-    </w:p>
-    <w:p>
-      <w:pPr>
-        <w:rPr>
-          <w:rFonts w:hint="default"/>
-          <w:lang w:val="en-US" w:eastAsia="zh-CN"/>
-        </w:rPr>
-      </w:pPr>
-      <w:r>
-        <w:rPr>
-          <w:rFonts w:hint="default"/>
-          <w:lang w:val="en-US" w:eastAsia="zh-CN"/>
-        </w:rPr>
-        <w:t>S_ref(λ)：参考电池光谱响应</w:t>
-      </w:r>
-    </w:p>
-    <w:p>
-      <w:pPr>
-        <w:rPr>
-          <w:rFonts w:hint="default"/>
-          <w:lang w:val="en-US" w:eastAsia="zh-CN"/>
-        </w:rPr>
-      </w:pPr>
-      <w:r>
-        <w:rPr>
-          <w:rFonts w:hint="default"/>
-          <w:lang w:val="en-US" w:eastAsia="zh-CN"/>
-        </w:rPr>
-        <w:t>S_DUT(λ)：被测器件（Device Under Test）光谱响应</w:t>
-      </w:r>
-    </w:p>
-    <w:p>
-      <w:pPr>
-        <w:rPr>
-          <w:rFonts w:hint="default"/>
-          <w:lang w:val="en-US" w:eastAsia="zh-CN"/>
-        </w:rPr>
-      </w:pPr>
-      <w:r>
-        <w:rPr>
-          <w:rFonts w:hint="default"/>
-          <w:lang w:val="en-US" w:eastAsia="zh-CN"/>
-        </w:rPr>
-        <w:t>SMM=1 表示完美匹配；SMM≠1 需要校正。</w:t>
-      </w:r>
-    </w:p>
-    <w:p>
-      <w:pPr>
-        <w:rPr>
-          <w:rFonts w:hint="default"/>
-          <w:lang w:val="en-US" w:eastAsia="zh-CN"/>
-        </w:rPr>
-      </w:pPr>
-    </w:p>
-    <w:p>
-      <w:pPr>
-        <w:rPr>
-          <w:rFonts w:hint="eastAsia"/>
-          <w:lang w:val="en-US" w:eastAsia="zh-CN"/>
-        </w:rPr>
-      </w:pPr>
-      <w:r>
-        <w:rPr>
-          <w:rFonts w:hint="eastAsia"/>
-          <w:lang w:val="en-US" w:eastAsia="zh-CN"/>
-        </w:rPr>
-        <w:t>Spectral Impact: 基于硅基电池</w:t>
-      </w:r>
-    </w:p>
-    <w:p>
-      <w:pPr>
-        <w:rPr>
-          <w:rFonts w:hint="default"/>
-          <w:lang w:val="en-US" w:eastAsia="zh-CN"/>
-        </w:rPr>
-      </w:pPr>
     </w:p>
     <w:p>
       <w:pPr>
@@ -780,7 +437,7 @@
   <w:docDefaults>
     <w:rPrDefault>
       <w:rPr>
-        <w:rFonts w:ascii="Times New Roman" w:hAnsi="Times New Roman" w:eastAsia="宋体" w:cs="Times New Roman"/>
+        <w:rFonts w:asciiTheme="minorHAnsi" w:hAnsiTheme="minorHAnsi" w:eastAsiaTheme="minorEastAsia" w:cstheme="minorBidi"/>
       </w:rPr>
     </w:rPrDefault>
     <w:pPrDefault/>
@@ -1051,13 +708,13 @@
       <w:lang w:val="en-US" w:eastAsia="zh-CN" w:bidi="ar-SA"/>
     </w:rPr>
   </w:style>
-  <w:style w:type="character" w:default="1" w:styleId="5">
+  <w:style w:type="character" w:default="1" w:styleId="3">
     <w:name w:val="Default Paragraph Font"/>
     <w:semiHidden/>
     <w:qFormat/>
     <w:uiPriority w:val="0"/>
   </w:style>
-  <w:style w:type="table" w:default="1" w:styleId="4">
+  <w:style w:type="table" w:default="1" w:styleId="2">
     <w:name w:val="Normal Table"/>
     <w:semiHidden/>
     <w:qFormat/>
@@ -1070,65 +727,6 @@
         <w:right w:w="108" w:type="dxa"/>
       </w:tblCellMar>
     </w:tblPr>
-  </w:style>
-  <w:style w:type="paragraph" w:styleId="2">
-    <w:name w:val="HTML Preformatted"/>
-    <w:basedOn w:val="1"/>
-    <w:uiPriority w:val="0"/>
-    <w:pPr>
-      <w:tabs>
-        <w:tab w:val="left" w:pos="916"/>
-        <w:tab w:val="left" w:pos="1832"/>
-        <w:tab w:val="left" w:pos="2748"/>
-        <w:tab w:val="left" w:pos="3664"/>
-        <w:tab w:val="left" w:pos="4580"/>
-        <w:tab w:val="left" w:pos="5496"/>
-        <w:tab w:val="left" w:pos="6412"/>
-        <w:tab w:val="left" w:pos="7328"/>
-        <w:tab w:val="left" w:pos="8244"/>
-        <w:tab w:val="left" w:pos="9160"/>
-        <w:tab w:val="left" w:pos="10076"/>
-        <w:tab w:val="left" w:pos="10992"/>
-        <w:tab w:val="left" w:pos="11908"/>
-        <w:tab w:val="left" w:pos="12824"/>
-        <w:tab w:val="left" w:pos="13740"/>
-        <w:tab w:val="left" w:pos="14656"/>
-      </w:tabs>
-      <w:jc w:val="left"/>
-    </w:pPr>
-    <w:rPr>
-      <w:rFonts w:hint="eastAsia" w:ascii="宋体" w:hAnsi="宋体" w:eastAsia="宋体" w:cs="宋体"/>
-      <w:kern w:val="0"/>
-      <w:sz w:val="24"/>
-      <w:szCs w:val="24"/>
-      <w:lang w:val="en-US" w:eastAsia="zh-CN" w:bidi="ar"/>
-    </w:rPr>
-  </w:style>
-  <w:style w:type="paragraph" w:styleId="3">
-    <w:name w:val="Normal (Web)"/>
-    <w:basedOn w:val="1"/>
-    <w:uiPriority w:val="0"/>
-    <w:rPr>
-      <w:sz w:val="24"/>
-    </w:rPr>
-  </w:style>
-  <w:style w:type="character" w:styleId="6">
-    <w:name w:val="Strong"/>
-    <w:basedOn w:val="5"/>
-    <w:qFormat/>
-    <w:uiPriority w:val="0"/>
-    <w:rPr>
-      <w:b/>
-    </w:rPr>
-  </w:style>
-  <w:style w:type="character" w:styleId="7">
-    <w:name w:val="HTML Code"/>
-    <w:basedOn w:val="5"/>
-    <w:uiPriority w:val="0"/>
-    <w:rPr>
-      <w:rFonts w:ascii="Courier New" w:hAnsi="Courier New"/>
-      <w:sz w:val="20"/>
-    </w:rPr>
   </w:style>
 </w:styles>
 </file>

</xml_diff>